<commit_message>
Add use-case flow spec for UC-06 Release Milestone Payment: preconditions, postconditions, main success scenario, alternate flow
</commit_message>
<xml_diff>
--- a/requirements/Requirements_Table.docx
+++ b/requirements/Requirements_Table.docx
@@ -32,8 +32,6 @@
           <w:u w:val="single"/>
         </w:rPr>
       </w:pPr>
-      <w:bookmarkStart w:id="0" w:name="_GoBack"/>
-      <w:bookmarkEnd w:id="0"/>
     </w:p>
     <w:tbl>
       <w:tblPr>
@@ -55,20 +53,14 @@
         <w:tblLook w:val="0000" w:firstRow="0" w:lastRow="0" w:firstColumn="0" w:lastColumn="0" w:noHBand="0" w:noVBand="0"/>
       </w:tblPr>
       <w:tblGrid>
-        <w:gridCol w:w="1000"/>
-        <w:gridCol w:w="1400"/>
-        <w:gridCol w:w="4600"/>
-        <w:gridCol w:w="1100"/>
-        <w:gridCol w:w="3600"/>
-        <w:gridCol w:w="2700"/>
+        <w:gridCol w:w="865"/>
+        <w:gridCol w:w="2691"/>
+        <w:gridCol w:w="3421"/>
+        <w:gridCol w:w="2400"/>
+        <w:gridCol w:w="2788"/>
+        <w:gridCol w:w="2235"/>
       </w:tblGrid>
       <w:tr>
-        <w:tblPrEx>
-          <w:tblCellMar>
-            <w:top w:w="0" w:type="dxa"/>
-            <w:bottom w:w="0" w:type="dxa"/>
-          </w:tblCellMar>
-        </w:tblPrEx>
         <w:trPr>
           <w:tblHeader/>
         </w:trPr>
@@ -101,8 +93,9 @@
                 <w:sz w:val="18"/>
                 <w:szCs w:val="18"/>
               </w:rPr>
-              <w:t>R</w:t>
-            </w:r>
+              <w:t>Req</w:t>
+            </w:r>
+            <w:proofErr w:type="spellEnd"/>
             <w:r>
               <w:rPr>
                 <w:b/>
@@ -111,9 +104,30 @@
                 <w:sz w:val="18"/>
                 <w:szCs w:val="18"/>
               </w:rPr>
-              <w:t>eq</w:t>
-            </w:r>
-            <w:proofErr w:type="spellEnd"/>
+              <w:t xml:space="preserve"> ID</w:t>
+            </w:r>
+          </w:p>
+        </w:tc>
+        <w:tc>
+          <w:tcPr>
+            <w:tcW w:w="1400" w:type="dxa"/>
+            <w:shd w:val="clear" w:color="auto" w:fill="auto"/>
+            <w:tcMar>
+              <w:top w:w="100" w:type="dxa"/>
+              <w:left w:w="100" w:type="dxa"/>
+              <w:bottom w:w="100" w:type="dxa"/>
+              <w:right w:w="100" w:type="dxa"/>
+            </w:tcMar>
+            <w:vAlign w:val="center"/>
+          </w:tcPr>
+          <w:p>
+            <w:pPr>
+              <w:rPr>
+                <w:color w:val="000000" w:themeColor="text1"/>
+                <w:sz w:val="18"/>
+                <w:szCs w:val="18"/>
+              </w:rPr>
+            </w:pPr>
             <w:r>
               <w:rPr>
                 <w:b/>
@@ -122,30 +136,8 @@
                 <w:sz w:val="18"/>
                 <w:szCs w:val="18"/>
               </w:rPr>
-              <w:t xml:space="preserve"> ID</w:t>
-            </w:r>
-          </w:p>
-        </w:tc>
-        <w:tc>
-          <w:tcPr>
-            <w:tcW w:w="1400" w:type="dxa"/>
-            <w:shd w:val="clear" w:color="auto" w:fill="auto"/>
-            <w:tcMar>
-              <w:top w:w="100" w:type="dxa"/>
-              <w:left w:w="100" w:type="dxa"/>
-              <w:bottom w:w="100" w:type="dxa"/>
-              <w:right w:w="100" w:type="dxa"/>
-            </w:tcMar>
-            <w:vAlign w:val="center"/>
-          </w:tcPr>
-          <w:p>
-            <w:pPr>
-              <w:rPr>
-                <w:color w:val="000000" w:themeColor="text1"/>
-                <w:sz w:val="18"/>
-                <w:szCs w:val="18"/>
-              </w:rPr>
-            </w:pPr>
+              <w:t>Type</w:t>
+            </w:r>
             <w:r>
               <w:rPr>
                 <w:b/>
@@ -154,7 +146,7 @@
                 <w:sz w:val="18"/>
                 <w:szCs w:val="18"/>
               </w:rPr>
-              <w:t>Type</w:t>
+              <w:t>(Functional/Nonfunctional)</w:t>
             </w:r>
           </w:p>
         </w:tc>
@@ -188,28 +180,6 @@
               </w:rPr>
               <w:t>Description</w:t>
             </w:r>
-          </w:p>
-        </w:tc>
-        <w:tc>
-          <w:tcPr>
-            <w:tcW w:w="1100" w:type="dxa"/>
-            <w:shd w:val="clear" w:color="auto" w:fill="auto"/>
-            <w:tcMar>
-              <w:top w:w="100" w:type="dxa"/>
-              <w:left w:w="100" w:type="dxa"/>
-              <w:bottom w:w="100" w:type="dxa"/>
-              <w:right w:w="100" w:type="dxa"/>
-            </w:tcMar>
-            <w:vAlign w:val="center"/>
-          </w:tcPr>
-          <w:p>
-            <w:pPr>
-              <w:rPr>
-                <w:color w:val="000000" w:themeColor="text1"/>
-                <w:sz w:val="18"/>
-                <w:szCs w:val="18"/>
-              </w:rPr>
-            </w:pPr>
             <w:r>
               <w:rPr>
                 <w:b/>
@@ -218,30 +188,8 @@
                 <w:sz w:val="18"/>
                 <w:szCs w:val="18"/>
               </w:rPr>
-              <w:t>Priority</w:t>
-            </w:r>
-          </w:p>
-        </w:tc>
-        <w:tc>
-          <w:tcPr>
-            <w:tcW w:w="3600" w:type="dxa"/>
-            <w:shd w:val="clear" w:color="auto" w:fill="auto"/>
-            <w:tcMar>
-              <w:top w:w="100" w:type="dxa"/>
-              <w:left w:w="100" w:type="dxa"/>
-              <w:bottom w:w="100" w:type="dxa"/>
-              <w:right w:w="100" w:type="dxa"/>
-            </w:tcMar>
-            <w:vAlign w:val="center"/>
-          </w:tcPr>
-          <w:p>
-            <w:pPr>
-              <w:rPr>
-                <w:color w:val="000000" w:themeColor="text1"/>
-                <w:sz w:val="18"/>
-                <w:szCs w:val="18"/>
-              </w:rPr>
-            </w:pPr>
+              <w:t xml:space="preserve"> </w:t>
+            </w:r>
             <w:r>
               <w:rPr>
                 <w:b/>
@@ -250,13 +198,13 @@
                 <w:sz w:val="18"/>
                 <w:szCs w:val="18"/>
               </w:rPr>
-              <w:t>Acceptance Criteria</w:t>
-            </w:r>
-          </w:p>
-        </w:tc>
-        <w:tc>
-          <w:tcPr>
-            <w:tcW w:w="2700" w:type="dxa"/>
+              <w:t>(“The system shall...”)</w:t>
+            </w:r>
+          </w:p>
+        </w:tc>
+        <w:tc>
+          <w:tcPr>
+            <w:tcW w:w="1100" w:type="dxa"/>
             <w:shd w:val="clear" w:color="auto" w:fill="auto"/>
             <w:tcMar>
               <w:top w:w="100" w:type="dxa"/>
@@ -282,18 +230,106 @@
                 <w:sz w:val="18"/>
                 <w:szCs w:val="18"/>
               </w:rPr>
+              <w:t>Priority</w:t>
+            </w:r>
+            <w:r>
+              <w:rPr>
+                <w:b/>
+                <w:bCs/>
+                <w:color w:val="000000" w:themeColor="text1"/>
+                <w:sz w:val="18"/>
+                <w:szCs w:val="18"/>
+              </w:rPr>
+              <w:t>(High/Medium/Low)</w:t>
+            </w:r>
+          </w:p>
+        </w:tc>
+        <w:tc>
+          <w:tcPr>
+            <w:tcW w:w="3600" w:type="dxa"/>
+            <w:shd w:val="clear" w:color="auto" w:fill="auto"/>
+            <w:tcMar>
+              <w:top w:w="100" w:type="dxa"/>
+              <w:left w:w="100" w:type="dxa"/>
+              <w:bottom w:w="100" w:type="dxa"/>
+              <w:right w:w="100" w:type="dxa"/>
+            </w:tcMar>
+            <w:vAlign w:val="center"/>
+          </w:tcPr>
+          <w:p>
+            <w:pPr>
+              <w:rPr>
+                <w:color w:val="000000" w:themeColor="text1"/>
+                <w:sz w:val="18"/>
+                <w:szCs w:val="18"/>
+              </w:rPr>
+            </w:pPr>
+            <w:r>
+              <w:rPr>
+                <w:b/>
+                <w:bCs/>
+                <w:color w:val="000000" w:themeColor="text1"/>
+                <w:sz w:val="18"/>
+                <w:szCs w:val="18"/>
+              </w:rPr>
+              <w:t>Acceptance Criteria</w:t>
+            </w:r>
+            <w:r>
+              <w:rPr>
+                <w:b/>
+                <w:bCs/>
+                <w:color w:val="000000" w:themeColor="text1"/>
+                <w:sz w:val="18"/>
+                <w:szCs w:val="18"/>
+              </w:rPr>
+              <w:t xml:space="preserve"> (</w:t>
+            </w:r>
+            <w:r>
+              <w:rPr>
+                <w:b/>
+                <w:bCs/>
+                <w:color w:val="000000" w:themeColor="text1"/>
+                <w:sz w:val="18"/>
+                <w:szCs w:val="18"/>
+              </w:rPr>
+              <w:t>pass/fail)</w:t>
+            </w:r>
+          </w:p>
+        </w:tc>
+        <w:tc>
+          <w:tcPr>
+            <w:tcW w:w="2700" w:type="dxa"/>
+            <w:shd w:val="clear" w:color="auto" w:fill="auto"/>
+            <w:tcMar>
+              <w:top w:w="100" w:type="dxa"/>
+              <w:left w:w="100" w:type="dxa"/>
+              <w:bottom w:w="100" w:type="dxa"/>
+              <w:right w:w="100" w:type="dxa"/>
+            </w:tcMar>
+            <w:vAlign w:val="center"/>
+          </w:tcPr>
+          <w:p>
+            <w:pPr>
+              <w:rPr>
+                <w:color w:val="000000" w:themeColor="text1"/>
+                <w:sz w:val="18"/>
+                <w:szCs w:val="18"/>
+              </w:rPr>
+            </w:pPr>
+            <w:r>
+              <w:rPr>
+                <w:b/>
+                <w:bCs/>
+                <w:color w:val="000000" w:themeColor="text1"/>
+                <w:sz w:val="18"/>
+                <w:szCs w:val="18"/>
+              </w:rPr>
               <w:t>Rationale</w:t>
             </w:r>
           </w:p>
         </w:tc>
       </w:tr>
       <w:tr>
-        <w:tblPrEx>
-          <w:tblCellMar>
-            <w:top w:w="0" w:type="dxa"/>
-            <w:bottom w:w="0" w:type="dxa"/>
-          </w:tblCellMar>
-        </w:tblPrEx>
         <w:tc>
           <w:tcPr>
             <w:tcW w:w="1000" w:type="dxa"/>
@@ -435,7 +471,23 @@
                 <w:sz w:val="18"/>
                 <w:szCs w:val="18"/>
               </w:rPr>
-              <w:t>Pass: Milestone marked completed and funds credited to creator balance. Fail: Funds released without client sign-off.</w:t>
+              <w:t xml:space="preserve">Pass: Milestone marked completed and funds credited to creator balance. </w:t>
+            </w:r>
+          </w:p>
+          <w:p>
+            <w:pPr>
+              <w:spacing w:after="80"/>
+              <w:rPr>
+                <w:sz w:val="18"/>
+                <w:szCs w:val="18"/>
+              </w:rPr>
+            </w:pPr>
+            <w:r>
+              <w:rPr>
+                <w:sz w:val="18"/>
+                <w:szCs w:val="18"/>
+              </w:rPr>
+              <w:t>Fail: Funds released without client sign-off.</w:t>
             </w:r>
           </w:p>
         </w:tc>
@@ -470,12 +522,6 @@
         </w:tc>
       </w:tr>
       <w:tr>
-        <w:tblPrEx>
-          <w:tblCellMar>
-            <w:top w:w="0" w:type="dxa"/>
-            <w:bottom w:w="0" w:type="dxa"/>
-          </w:tblCellMar>
-        </w:tblPrEx>
         <w:tc>
           <w:tcPr>
             <w:tcW w:w="1000" w:type="dxa"/>
@@ -530,14 +576,7 @@
                 <w:sz w:val="18"/>
                 <w:szCs w:val="18"/>
               </w:rPr>
-              <w:t>Functio</w:t>
-            </w:r>
-            <w:r>
-              <w:rPr>
-                <w:sz w:val="18"/>
-                <w:szCs w:val="18"/>
-              </w:rPr>
-              <w:t>nal</w:t>
+              <w:t>Functional</w:t>
             </w:r>
           </w:p>
         </w:tc>
@@ -624,7 +663,23 @@
                 <w:sz w:val="18"/>
                 <w:szCs w:val="18"/>
               </w:rPr>
-              <w:t>Pass: A milestone cannot be set to “Active” until both parties have digitally confirmed its description, due date, and amount. Fail: A milestone becomes active with only one party's confirmation.</w:t>
+              <w:t>Pass: A milestone cannot be set to “Active” until both parties have digitally confirmed its description, due date, and amount.</w:t>
+            </w:r>
+          </w:p>
+          <w:p>
+            <w:pPr>
+              <w:spacing w:after="80"/>
+              <w:rPr>
+                <w:sz w:val="18"/>
+                <w:szCs w:val="18"/>
+              </w:rPr>
+            </w:pPr>
+            <w:r>
+              <w:rPr>
+                <w:sz w:val="18"/>
+                <w:szCs w:val="18"/>
+              </w:rPr>
+              <w:t>Fail: A milestone becomes active with only one party's confirmation.</w:t>
             </w:r>
           </w:p>
         </w:tc>
@@ -653,25 +708,12 @@
                 <w:sz w:val="18"/>
                 <w:szCs w:val="18"/>
               </w:rPr>
-              <w:t>Establishes an unambiguous, mutually agreed scope and paymen</w:t>
-            </w:r>
-            <w:r>
-              <w:rPr>
-                <w:sz w:val="18"/>
-                <w:szCs w:val="18"/>
-              </w:rPr>
-              <w:t>t amount up front, preventing later disputes over deliverable expectations.</w:t>
+              <w:t>Establishes an unambiguous, mutually agreed scope and payment amount up front, preventing later disputes over deliverable expectations.</w:t>
             </w:r>
           </w:p>
         </w:tc>
       </w:tr>
       <w:tr>
-        <w:tblPrEx>
-          <w:tblCellMar>
-            <w:top w:w="0" w:type="dxa"/>
-            <w:bottom w:w="0" w:type="dxa"/>
-          </w:tblCellMar>
-        </w:tblPrEx>
         <w:tc>
           <w:tcPr>
             <w:tcW w:w="1000" w:type="dxa"/>
@@ -755,14 +797,7 @@
                 <w:sz w:val="18"/>
                 <w:szCs w:val="18"/>
               </w:rPr>
-              <w:t>The system shall automatically apply a visible watermark to every draft image or video asset uploaded by the creator before it becomes visible to the sponsor for</w:t>
-            </w:r>
-            <w:r>
-              <w:rPr>
-                <w:sz w:val="18"/>
-                <w:szCs w:val="18"/>
-              </w:rPr>
-              <w:t xml:space="preserve"> review.</w:t>
+              <w:t>The system shall automatically apply a visible watermark to every draft image or video asset uploaded by the creator before it becomes visible to the sponsor for review.</w:t>
             </w:r>
           </w:p>
         </w:tc>
@@ -820,7 +855,30 @@
                 <w:sz w:val="18"/>
                 <w:szCs w:val="18"/>
               </w:rPr>
-              <w:t>Pass: 100% of sampled sponsor-visible draft previews display the watermark overlay. Fail: Any sponsor-visible draft is missing the watermark.</w:t>
+              <w:t>Pass: 100% of sampled sponsor-visible draft previews</w:t>
+            </w:r>
+            <w:r>
+              <w:rPr>
+                <w:sz w:val="18"/>
+                <w:szCs w:val="18"/>
+              </w:rPr>
+              <w:t xml:space="preserve"> display the watermark overlay.</w:t>
+            </w:r>
+          </w:p>
+          <w:p>
+            <w:pPr>
+              <w:spacing w:after="80"/>
+              <w:rPr>
+                <w:sz w:val="18"/>
+                <w:szCs w:val="18"/>
+              </w:rPr>
+            </w:pPr>
+            <w:r>
+              <w:rPr>
+                <w:sz w:val="18"/>
+                <w:szCs w:val="18"/>
+              </w:rPr>
+              <w:t>Fail: Any sponsor-visible draft is missing the watermark.</w:t>
             </w:r>
           </w:p>
         </w:tc>
@@ -849,25 +907,12 @@
                 <w:sz w:val="18"/>
                 <w:szCs w:val="18"/>
               </w:rPr>
-              <w:t>Prevents unauthorized use or redistribution of unpaid draft work, protecting the creator's intellect</w:t>
-            </w:r>
-            <w:r>
-              <w:rPr>
-                <w:sz w:val="18"/>
-                <w:szCs w:val="18"/>
-              </w:rPr>
-              <w:t>ual property during review.</w:t>
+              <w:t>Prevents unauthorized use or redistribution of unpaid draft work, protecting the creator's intellectual property during review.</w:t>
             </w:r>
           </w:p>
         </w:tc>
       </w:tr>
       <w:tr>
-        <w:tblPrEx>
-          <w:tblCellMar>
-            <w:top w:w="0" w:type="dxa"/>
-            <w:bottom w:w="0" w:type="dxa"/>
-          </w:tblCellMar>
-        </w:tblPrEx>
         <w:tc>
           <w:tcPr>
             <w:tcW w:w="1000" w:type="dxa"/>
@@ -1009,7 +1054,37 @@
                 <w:sz w:val="18"/>
                 <w:szCs w:val="18"/>
               </w:rPr>
-              <w:t>Pass: Rejected milestone's funds remain locked in escrow and status changes to “Pending Revision” with the comment visible to the creator. Fail: Milestone auto-advances to “Completed” despite rejection, or comments are not delivered.</w:t>
+              <w:t xml:space="preserve">Pass: Rejected milestone's funds remain locked in escrow and status changes to “Pending Revision” with the </w:t>
+            </w:r>
+            <w:r>
+              <w:rPr>
+                <w:sz w:val="18"/>
+                <w:szCs w:val="18"/>
+              </w:rPr>
+              <w:t>comment visible to the creator.</w:t>
+            </w:r>
+          </w:p>
+          <w:p>
+            <w:pPr>
+              <w:spacing w:after="80"/>
+              <w:rPr>
+                <w:sz w:val="18"/>
+                <w:szCs w:val="18"/>
+              </w:rPr>
+            </w:pPr>
+            <w:r>
+              <w:rPr>
+                <w:sz w:val="18"/>
+                <w:szCs w:val="18"/>
+              </w:rPr>
+              <w:t xml:space="preserve"> </w:t>
+            </w:r>
+            <w:r>
+              <w:rPr>
+                <w:sz w:val="18"/>
+                <w:szCs w:val="18"/>
+              </w:rPr>
+              <w:t>Fail: Milestone auto-advances to “Completed” despite rejection, or comments are not delivered.</w:t>
             </w:r>
           </w:p>
         </w:tc>
@@ -1038,25 +1113,12 @@
                 <w:sz w:val="18"/>
                 <w:szCs w:val="18"/>
               </w:rPr>
-              <w:t>Gives sponsors a struc</w:t>
-            </w:r>
-            <w:r>
-              <w:rPr>
-                <w:sz w:val="18"/>
-                <w:szCs w:val="18"/>
-              </w:rPr>
-              <w:t>tured way to request changes without cancelling the contract or losing escrowed funds, supporting iteration.</w:t>
+              <w:t>Gives sponsors a structured way to request changes without cancelling the contract or losing escrowed funds, supporting iteration.</w:t>
             </w:r>
           </w:p>
         </w:tc>
       </w:tr>
       <w:tr>
-        <w:tblPrEx>
-          <w:tblCellMar>
-            <w:top w:w="0" w:type="dxa"/>
-            <w:bottom w:w="0" w:type="dxa"/>
-          </w:tblCellMar>
-        </w:tblPrEx>
         <w:tc>
           <w:tcPr>
             <w:tcW w:w="1000" w:type="dxa"/>
@@ -1198,14 +1260,30 @@
                 <w:sz w:val="18"/>
                 <w:szCs w:val="18"/>
               </w:rPr>
-              <w:t xml:space="preserve">Pass: A disputed milestone is frozen (no </w:t>
-            </w:r>
-            <w:r>
-              <w:rPr>
-                <w:sz w:val="18"/>
-                <w:szCs w:val="18"/>
-              </w:rPr>
-              <w:t>payment release or auto-cancellation) until the moderator records a resolution outcome. Fail: Escrowed funds are released or refunded automatically while a dispute is open.</w:t>
+              <w:t>Pass: A disputed milestone is frozen (no payment release or auto-cancellation) until the moderator records a resolution ou</w:t>
+            </w:r>
+            <w:r>
+              <w:rPr>
+                <w:sz w:val="18"/>
+                <w:szCs w:val="18"/>
+              </w:rPr>
+              <w:t>tcome.</w:t>
+            </w:r>
+          </w:p>
+          <w:p>
+            <w:pPr>
+              <w:spacing w:after="80"/>
+              <w:rPr>
+                <w:sz w:val="18"/>
+                <w:szCs w:val="18"/>
+              </w:rPr>
+            </w:pPr>
+            <w:r>
+              <w:rPr>
+                <w:sz w:val="18"/>
+                <w:szCs w:val="18"/>
+              </w:rPr>
+              <w:t>Fail: Escrowed funds are released or refunded automatically while a dispute is open.</w:t>
             </w:r>
           </w:p>
         </w:tc>
@@ -1234,25 +1312,12 @@
                 <w:sz w:val="18"/>
                 <w:szCs w:val="18"/>
               </w:rPr>
-              <w:t>Provides a fair, auditable conflict-resolution path when the two primary parties ca</w:t>
-            </w:r>
-            <w:r>
-              <w:rPr>
-                <w:sz w:val="18"/>
-                <w:szCs w:val="18"/>
-              </w:rPr>
-              <w:t>nnot agree, increasing platform trust.</w:t>
+              <w:t>Provides a fair, auditable conflict-resolution path when the two primary parties cannot agree, increasing platform trust.</w:t>
             </w:r>
           </w:p>
         </w:tc>
       </w:tr>
       <w:tr>
-        <w:tblPrEx>
-          <w:tblCellMar>
-            <w:top w:w="0" w:type="dxa"/>
-            <w:bottom w:w="0" w:type="dxa"/>
-          </w:tblCellMar>
-        </w:tblPrEx>
         <w:trPr>
           <w:trHeight w:val="1111"/>
         </w:trPr>
@@ -1397,8 +1462,34 @@
                 <w:sz w:val="18"/>
                 <w:szCs w:val="18"/>
               </w:rPr>
-              <w:t>Pass: Benchmarking tests confirm target latency and security standards under simulated peak load. Fail: Watermarking exceeds 5 seconds for any sampled asset under peak load.</w:t>
-            </w:r>
+              <w:t>Pass: Benchmarking tests confirm target latency and security stand</w:t>
+            </w:r>
+            <w:r>
+              <w:rPr>
+                <w:sz w:val="18"/>
+                <w:szCs w:val="18"/>
+              </w:rPr>
+              <w:t>ards under simulated peak load.</w:t>
+            </w:r>
+          </w:p>
+          <w:p>
+            <w:pPr>
+              <w:spacing w:after="80"/>
+              <w:rPr>
+                <w:sz w:val="18"/>
+                <w:szCs w:val="18"/>
+              </w:rPr>
+            </w:pPr>
+            <w:r>
+              <w:rPr>
+                <w:sz w:val="18"/>
+                <w:szCs w:val="18"/>
+              </w:rPr>
+              <w:lastRenderedPageBreak/>
+              <w:t>Fail: Watermarking exceeds 5 seconds for any sampled asset under peak load.</w:t>
+            </w:r>
+            <w:bookmarkStart w:id="0" w:name="_GoBack"/>
+            <w:bookmarkEnd w:id="0"/>
           </w:p>
         </w:tc>
         <w:tc>
@@ -1426,25 +1517,21 @@
                 <w:sz w:val="18"/>
                 <w:szCs w:val="18"/>
               </w:rPr>
-              <w:t xml:space="preserve">Keeps the review workflow responsive so sponsors are not kept waiting, supporting </w:t>
-            </w:r>
-            <w:r>
-              <w:rPr>
-                <w:sz w:val="18"/>
-                <w:szCs w:val="18"/>
-              </w:rPr>
-              <w:t>smooth collaboration during peak submission periods.</w:t>
+              <w:lastRenderedPageBreak/>
+              <w:t xml:space="preserve">Keeps the review workflow responsive so sponsors are not kept waiting, supporting smooth collaboration </w:t>
+            </w:r>
+            <w:r>
+              <w:rPr>
+                <w:sz w:val="18"/>
+                <w:szCs w:val="18"/>
+              </w:rPr>
+              <w:lastRenderedPageBreak/>
+              <w:t>during peak submission periods.</w:t>
             </w:r>
           </w:p>
         </w:tc>
       </w:tr>
       <w:tr>
-        <w:tblPrEx>
-          <w:tblCellMar>
-            <w:top w:w="0" w:type="dxa"/>
-            <w:bottom w:w="0" w:type="dxa"/>
-          </w:tblCellMar>
-        </w:tblPrEx>
         <w:trPr>
           <w:trHeight w:val="457"/>
         </w:trPr>
@@ -1473,6 +1560,7 @@
                 <w:sz w:val="18"/>
                 <w:szCs w:val="18"/>
               </w:rPr>
+              <w:lastRenderedPageBreak/>
               <w:t>NFR-002</w:t>
             </w:r>
           </w:p>
@@ -1589,14 +1677,30 @@
                 <w:sz w:val="18"/>
                 <w:szCs w:val="18"/>
               </w:rPr>
-              <w:t>Pass: A security audit confirms walle</w:t>
-            </w:r>
-            <w:r>
-              <w:rPr>
-                <w:sz w:val="18"/>
-                <w:szCs w:val="18"/>
-              </w:rPr>
-              <w:t>t data is encrypted at rest and in transit, and 100% of fund-movement events appear in the audit log with correct timestamp and actor. Fail: Any fund transaction lacks a corresponding audit record, or wallet data is found unencrypted.</w:t>
+              <w:t>Pass: A security audit confirms wallet data is encrypted at rest and in transit, and 100% of fund-movement events appear in the audit log wi</w:t>
+            </w:r>
+            <w:r>
+              <w:rPr>
+                <w:sz w:val="18"/>
+                <w:szCs w:val="18"/>
+              </w:rPr>
+              <w:t>th correct timestamp and actor.</w:t>
+            </w:r>
+          </w:p>
+          <w:p>
+            <w:pPr>
+              <w:spacing w:after="80"/>
+              <w:rPr>
+                <w:sz w:val="18"/>
+                <w:szCs w:val="18"/>
+              </w:rPr>
+            </w:pPr>
+            <w:r>
+              <w:rPr>
+                <w:sz w:val="18"/>
+                <w:szCs w:val="18"/>
+              </w:rPr>
+              <w:t>Fail: Any fund transaction lacks a corresponding audit record, or wallet data is found unencrypted.</w:t>
             </w:r>
           </w:p>
         </w:tc>
@@ -1625,14 +1729,7 @@
                 <w:sz w:val="18"/>
                 <w:szCs w:val="18"/>
               </w:rPr>
-              <w:t>Escrowed money is the</w:t>
-            </w:r>
-            <w:r>
-              <w:rPr>
-                <w:sz w:val="18"/>
-                <w:szCs w:val="18"/>
-              </w:rPr>
-              <w:t xml:space="preserve"> platform's core trust mechanism; encryption and immutable logging protect against fraud/tampering and support dispute resolution and compliance.</w:t>
+              <w:t>Escrowed money is the platform's core trust mechanism; encryption and immutable logging protect against fraud/tampering and support dispute resolution and compliance.</w:t>
             </w:r>
           </w:p>
         </w:tc>

</xml_diff>